<commit_message>
docs: update GDD and art asset brief
Co-Authored-By: Claude Sonnet 5 <noreply@anthropic.com>
</commit_message>
<xml_diff>
--- a/Documentation~/Art_Asset_Brief.docx
+++ b/Documentation~/Art_Asset_Brief.docx
@@ -129,7 +129,7 @@
         <w:t xml:space="preserve">Цветовое кодирование фракций: </w:t>
       </w:r>
       <w:r>
-        <w:t xml:space="preserve">корпоративная охрана (дроны, щитовики, турели) — циан. Уличные банды (громилы, кибер-псы) — маджента. Игрок и его эффекты/подбираемые предметы — жёлтый. Это не эстетическая прихоть — игрок должен опознавать «источник угрозы» по цвету за долю секунды в гуще боя.</w:t>
+        <w:t xml:space="preserve">корпоративная охрана (дроны, щитовики, турели) — циан. Уличные банды (паук-разведчики, кибер-псы — перехваченная и перепрошитая корпоративная техника) — маджента. Игрок и его эффекты/подбираемые предметы — жёлтый. Это не эстетическая прихоть — игрок должен опознавать «источник угрозы» по цвету за долю секунды в гуще боя.</w:t>
       </w:r>
     </w:p>
     <w:p>
@@ -562,7 +562,7 @@
         <w:spacing w:after="80"/>
       </w:pPr>
       <w:r>
-        <w:t xml:space="preserve">enemy_punk_death_01.png ... enemy_punk_death_04.png</w:t>
+        <w:t xml:space="preserve">enemy_spiderscout_death_01.png ... enemy_spiderscout_death_04.png</w:t>
       </w:r>
     </w:p>
     <w:p>
@@ -628,6 +628,88 @@
     </w:p>
     <w:p>
       <w:pPr>
+        <w:pStyle w:val="Heading2"/>
+        <w:spacing w:after="120" w:before="250"/>
+      </w:pPr>
+      <w:r>
+        <w:t xml:space="preserve">0.7 Персонаж и оружие — где проходит граница</w:t>
+      </w:r>
+    </w:p>
+    <w:p>
+      <w:pPr>
+        <w:spacing w:after="120"/>
+      </w:pPr>
+      <w:r>
+        <w:t xml:space="preserve">Важное архитектурное ограничение, которое напрямую влияет на арт: у игрока в бою может быть открыто до 6 слотов оружия одновременно (см. GDD 3.2), и любой из них можно докупить в любой момент забега. Поэтому:</w:t>
+      </w:r>
+    </w:p>
+    <w:p>
+      <w:pPr>
+        <w:pStyle w:val="ListParagraph"/>
+        <w:numPr>
+          <w:ilvl w:val="0"/>
+          <w:numId w:val="2"/>
+        </w:numPr>
+        <w:spacing w:after="80"/>
+      </w:pPr>
+      <w:r>
+        <w:rPr>
+          <w:b/>
+          <w:bCs/>
+        </w:rPr>
+        <w:t xml:space="preserve">Character-спрайт (Idle/Walk/Death) — всегда «пустые руки», без оружия любого рода. </w:t>
+      </w:r>
+      <w:r>
+        <w:t xml:space="preserve">Ни меча за спиной, ни пистолета в руке — никакая деталь экипировки не рисуется как часть персонажа, даже стартовое оружие. Причина: на экране оружие всегда отрисовывается отдельным объектом, который движок позиционирует вокруг персонажа сам (вращает по орбите, стреляет снарядами и т.д.) — если то же оружие ещё и нарисовано на самом персонаже, они будут визуально дублироваться/расходиться.</w:t>
+      </w:r>
+    </w:p>
+    <w:p>
+      <w:pPr>
+        <w:pStyle w:val="ListParagraph"/>
+        <w:numPr>
+          <w:ilvl w:val="0"/>
+          <w:numId w:val="2"/>
+        </w:numPr>
+        <w:spacing w:after="80"/>
+      </w:pPr>
+      <w:r>
+        <w:rPr>
+          <w:b/>
+          <w:bCs/>
+        </w:rPr>
+        <w:t xml:space="preserve">Каждое оружие — независимый спрайт (см. разделы 1.2, 2.3). </w:t>
+      </w:r>
+      <w:r>
+        <w:t xml:space="preserve">Это касается и оружия, с которым персонаж стартует забег: технически оно просто заранее лежит в первом слоте и спавнится как обычный объект оружия в момент старта волны, а не рисуется на персонаже.</w:t>
+      </w:r>
+    </w:p>
+    <w:p>
+      <w:pPr>
+        <w:pStyle w:val="ListParagraph"/>
+        <w:numPr>
+          <w:ilvl w:val="0"/>
+          <w:numId w:val="2"/>
+        </w:numPr>
+        <w:spacing w:after="80"/>
+      </w:pPr>
+      <w:r>
+        <w:rPr>
+          <w:b/>
+          <w:bCs/>
+        </w:rPr>
+        <w:t xml:space="preserve">Исключение — статичные портретные иллюстрации </w:t>
+      </w:r>
+      <w:r>
+        <w:t xml:space="preserve">(экран выбора персонажа, меню, см. 3.2). Это не игровой спрайт, а разовая постановочная картинка, поэтому там можно и нужно показать персонажа с фирменным оружием в руке для узнаваемости — на геймплей это никак не завязано.</w:t>
+      </w:r>
+    </w:p>
+    <w:p>
+      <w:pPr>
+        <w:spacing w:after="100"/>
+      </w:pPr>
+    </w:p>
+    <w:p>
+      <w:pPr>
         <w:pStyle w:val="Heading1"/>
         <w:spacing w:after="150" w:before="300"/>
       </w:pPr>
@@ -664,7 +746,7 @@
         <w:spacing w:after="120"/>
       </w:pPr>
       <w:r>
-        <w:t xml:space="preserve">Стартовый персонаж. Силуэт: подтянутый, чуть наклонён вперёд (ощущение скорости). Акцент — жёлтый (цвет игрока, см. 0.1). Моноклинок висит за спиной в Idle и Walk (само оружие анимируется отдельно, см. 1.2).</w:t>
+        <w:t xml:space="preserve">Стартовый персонаж. Силуэт: подтянутый, чуть наклонён вперёд (ощущение скорости). Акцент — жёлтый (цвет игрока, см. 0.1). Руки пустые, оружия на спрайте нет ни в Idle, ни в Walk — см. принцип в 0.7. Моноклинок в бою существует как отдельный вращающийся объект, не как деталь персонажа.</w:t>
       </w:r>
     </w:p>
     <w:tbl>
@@ -1326,7 +1408,7 @@
         <w:spacing w:after="120" w:before="250"/>
       </w:pPr>
       <w:r>
-        <w:t xml:space="preserve">1.3 Враг: Панк-громила</w:t>
+        <w:t xml:space="preserve">1.3 Враг: Паук-разведчик</w:t>
       </w:r>
     </w:p>
     <w:p>
@@ -1334,7 +1416,67 @@
         <w:spacing w:after="120"/>
       </w:pPr>
       <w:r>
-        <w:t xml:space="preserve">Базовый melee-фодер, самый частый враг на экране — приоритет по количеству кадров и чистоте силуэта. Акцент — маджента (уличная банда, см. 0.1). Силуэт шире и приземистее Ронина, чтобы не путались на бегу.</w:t>
+        <w:t xml:space="preserve">Базовый melee-фодер, самый частый враг на экране — приоритет по количеству кадров и чистоте силуэта. По флейвору — перехваченный и перепрошитый уличной бандой корпоративный разведывательный дрон, отсюда механический силуэт при магента-акценте банд (см. 0.1). Канвас меньше игрока (96 против 128) — фодер не должен весить на экране так же, как игрок или дрон (см. 0.7-логику размеров ниже).</w:t>
+      </w:r>
+    </w:p>
+    <w:p>
+      <w:pPr>
+        <w:pStyle w:val="ListParagraph"/>
+        <w:numPr>
+          <w:ilvl w:val="0"/>
+          <w:numId w:val="2"/>
+        </w:numPr>
+        <w:spacing w:after="80"/>
+      </w:pPr>
+      <w:r>
+        <w:rPr>
+          <w:b/>
+          <w:bCs/>
+        </w:rPr>
+        <w:t xml:space="preserve">Силуэт: </w:t>
+      </w:r>
+      <w:r>
+        <w:t xml:space="preserve">компактный шестиногий (гексапод) корпус — узнаваемый геометричный силуэт даже в толпе. Центральный читаемый элемент — единый моно-объектив/линза-«глаз» на передней части корпуса, сразу считывается как разведывательная техника.</w:t>
+      </w:r>
+    </w:p>
+    <w:p>
+      <w:pPr>
+        <w:pStyle w:val="ListParagraph"/>
+        <w:numPr>
+          <w:ilvl w:val="0"/>
+          <w:numId w:val="2"/>
+        </w:numPr>
+        <w:spacing w:after="80"/>
+      </w:pPr>
+      <w:r>
+        <w:rPr>
+          <w:b/>
+          <w:bCs/>
+        </w:rPr>
+        <w:t xml:space="preserve">Движение: </w:t>
+      </w:r>
+      <w:r>
+        <w:t xml:space="preserve">простое прямолинейное сближение с игроком, без смены направления и без рывков в самой анимации — ровный бег на 6 ногах по фазам, как у обычного ходового цикла. Как самый первый враг в игре (прототип недели 1), он должен быть самым дешёвым и предсказуемым — усложнять поведение можно у более поздних врагов.</w:t>
+      </w:r>
+    </w:p>
+    <w:p>
+      <w:pPr>
+        <w:pStyle w:val="ListParagraph"/>
+        <w:numPr>
+          <w:ilvl w:val="0"/>
+          <w:numId w:val="2"/>
+        </w:numPr>
+        <w:spacing w:after="80"/>
+      </w:pPr>
+      <w:r>
+        <w:rPr>
+          <w:b/>
+          <w:bCs/>
+        </w:rPr>
+        <w:t xml:space="preserve">Отличие от Кибер-пса (см. 2.1): </w:t>
+      </w:r>
+      <w:r>
+        <w:t xml:space="preserve">у паука механические тонкие сегментированные конечности и их заметно больше (6 против 4), тело угловатое/геометричное — не спутать с органическим силуэтом пса на бегу.</w:t>
       </w:r>
     </w:p>
     <w:tbl>
@@ -1461,7 +1603,7 @@
                 <w:b w:val="false"/>
                 <w:bCs w:val="false"/>
               </w:rPr>
-              <w:t xml:space="preserve">enemy_punk</w:t>
+              <w:t xml:space="preserve">enemy_spiderscout</w:t>
             </w:r>
           </w:p>
         </w:tc>
@@ -1501,7 +1643,7 @@
                 <w:b w:val="false"/>
                 <w:bCs w:val="false"/>
               </w:rPr>
-              <w:t xml:space="preserve">128×128 px</w:t>
+              <w:t xml:space="preserve">96×96 px</w:t>
             </w:r>
           </w:p>
         </w:tc>
@@ -1521,7 +1663,7 @@
                 <w:b w:val="false"/>
                 <w:bCs w:val="false"/>
               </w:rPr>
-              <w:t xml:space="preserve">Прямолинейный рывок на игрока, без смены направления в анимации</w:t>
+              <w:t xml:space="preserve">Прямолинейный бег на игрока, без смены направления в анимации</w:t>
             </w:r>
           </w:p>
         </w:tc>
@@ -1543,7 +1685,7 @@
                 <w:b w:val="false"/>
                 <w:bCs w:val="false"/>
               </w:rPr>
-              <w:t xml:space="preserve">enemy_punk</w:t>
+              <w:t xml:space="preserve">enemy_spiderscout</w:t>
             </w:r>
           </w:p>
         </w:tc>
@@ -1583,7 +1725,7 @@
                 <w:b w:val="false"/>
                 <w:bCs w:val="false"/>
               </w:rPr>
-              <w:t xml:space="preserve">128×128 px</w:t>
+              <w:t xml:space="preserve">96×96 px</w:t>
             </w:r>
           </w:p>
         </w:tc>
@@ -1603,7 +1745,7 @@
                 <w:b w:val="false"/>
                 <w:bCs w:val="false"/>
               </w:rPr>
-              <w:t xml:space="preserve">Резкая, читаемая гибель — это основной фидбек «попадание засчитано»</w:t>
+              <w:t xml:space="preserve">Механический коллапс — ноги подламываются/складываются, а не «падение тела» как у органики</w:t>
             </w:r>
           </w:p>
         </w:tc>
@@ -1974,7 +2116,7 @@
         <w:spacing w:after="100"/>
       </w:pPr>
       <w:r>
-        <w:t xml:space="preserve">☐  enemy_punk (Walk 6, Death 4)</w:t>
+        <w:t xml:space="preserve">☐  enemy_spiderscout (Walk 6, Death 4)</w:t>
       </w:r>
     </w:p>
     <w:p>
@@ -2280,7 +2422,7 @@
                 <w:b w:val="false"/>
                 <w:bCs w:val="false"/>
               </w:rPr>
-              <w:t xml:space="preserve">96×96 px</w:t>
+              <w:t xml:space="preserve">80×80 px</w:t>
             </w:r>
           </w:p>
         </w:tc>
@@ -2300,7 +2442,7 @@
                 <w:b w:val="false"/>
                 <w:bCs w:val="false"/>
               </w:rPr>
-              <w:t xml:space="preserve">Меньше Панк-громилы, силуэт ниже и вытянутее (на четырёх лапах). Акцент маджента</w:t>
+              <w:t xml:space="preserve">Ещё меньше Паука-разведчика, силуэт ниже и вытянутее (на четырёх лапах, органический в отличие от паука) — самый мелкий враг в игре, компенсирует это числом в стае. Акцент маджента</w:t>
             </w:r>
           </w:p>
         </w:tc>
@@ -4497,7 +4639,7 @@
                 <w:b w:val="false"/>
                 <w:bCs w:val="false"/>
               </w:rPr>
-              <w:t xml:space="preserve">Смарт-пистолет в руке в Idle/Walk (сам выстрел анимирует оружие, см. Часть 2)</w:t>
+              <w:t xml:space="preserve">Руки пустые, без оружия на спрайте (см. 0.7) — смарт-пистолет в бою существует как отдельный объект</w:t>
             </w:r>
           </w:p>
         </w:tc>
@@ -4539,7 +4681,7 @@
                 <w:b w:val="false"/>
                 <w:bCs w:val="false"/>
               </w:rPr>
-              <w:t xml:space="preserve">Idle — 4 кадра, Walk — 6 кадров</w:t>
+              <w:t xml:space="preserve">Idle — 4 кадра, Walk — 6 кадров, Death — 4 кадра</w:t>
             </w:r>
           </w:p>
         </w:tc>
@@ -4559,7 +4701,7 @@
                 <w:b w:val="false"/>
                 <w:bCs w:val="false"/>
               </w:rPr>
-              <w:t xml:space="preserve">96×96 px (меньше игрока — это питомец)</w:t>
+              <w:t xml:space="preserve">128×128 px</w:t>
             </w:r>
           </w:p>
         </w:tc>
@@ -4579,7 +4721,7 @@
                 <w:b w:val="false"/>
                 <w:bCs w:val="false"/>
               </w:rPr>
-              <w:t xml:space="preserve">Дрон-питомец, летает/парит рядом с игроком, силуэт явно небольшой и механический</w:t>
+              <w:t xml:space="preserve">Это тело самого персонажа (компактный бот-разведчик), а не оружие — руки/корпус без оружия, как у остальных (см. 0.7). Дрон-питомец, которым он атакует — отдельный оружейный ассет, см. 3.1a</w:t>
             </w:r>
           </w:p>
         </w:tc>
@@ -4596,7 +4738,309 @@
         <w:spacing w:after="120" w:before="250"/>
       </w:pPr>
       <w:r>
+        <w:t xml:space="preserve">3.1a Оружие Монтера: дрон-питомец</w:t>
+      </w:r>
+    </w:p>
+    <w:p>
+      <w:pPr>
+        <w:spacing w:after="120"/>
+      </w:pPr>
+      <w:r>
+        <w:t xml:space="preserve">Стартовое оружие Монтера — AoE-тип по системе 3.2 ГДД, пятый уникальный тип оружия сверх четырёх описанных в Части 2. Патрулирует вокруг тела Монтера по коду и наносит урон по площади — художнику вращение/патрулирование анимировать не нужно, как и в случае с weapon_monoblade (см. 1.2).</w:t>
+      </w:r>
+    </w:p>
+    <w:tbl>
+      <w:tblPr>
+        <w:tblW w:type="dxa" w:w="10000"/>
+        <w:tblBorders>
+          <w:top w:val="single" w:color="auto" w:sz="4"/>
+          <w:left w:val="single" w:color="auto" w:sz="4"/>
+          <w:bottom w:val="single" w:color="auto" w:sz="4"/>
+          <w:right w:val="single" w:color="auto" w:sz="4"/>
+          <w:insideH w:val="single" w:color="auto" w:sz="4"/>
+          <w:insideV w:val="single" w:color="auto" w:sz="4"/>
+        </w:tblBorders>
+      </w:tblPr>
+      <w:tblGrid>
+        <w:gridCol w:w="2500"/>
+        <w:gridCol w:w="3600"/>
+        <w:gridCol w:w="1500"/>
+        <w:gridCol w:w="2400"/>
+      </w:tblGrid>
+      <w:tr>
+        <w:trPr>
+          <w:tblHeader/>
+        </w:trPr>
+        <w:tc>
+          <w:tcPr>
+            <w:tcW w:type="dxa" w:w="2500"/>
+            <w:shd w:fill="D9D9D9" w:val="clear"/>
+            <w:tcMar>
+              <w:top w:type="dxa" w:w="80"/>
+              <w:left w:type="dxa" w:w="100"/>
+              <w:bottom w:type="dxa" w:w="80"/>
+              <w:right w:type="dxa" w:w="100"/>
+            </w:tcMar>
+          </w:tcPr>
+          <w:p>
+            <w:r>
+              <w:rPr>
+                <w:b/>
+                <w:bCs/>
+              </w:rPr>
+              <w:t xml:space="preserve">Ассет</w:t>
+            </w:r>
+          </w:p>
+        </w:tc>
+        <w:tc>
+          <w:tcPr>
+            <w:tcW w:type="dxa" w:w="3600"/>
+            <w:shd w:fill="D9D9D9" w:val="clear"/>
+            <w:tcMar>
+              <w:top w:type="dxa" w:w="80"/>
+              <w:left w:type="dxa" w:w="100"/>
+              <w:bottom w:type="dxa" w:w="80"/>
+              <w:right w:type="dxa" w:w="100"/>
+            </w:tcMar>
+          </w:tcPr>
+          <w:p>
+            <w:r>
+              <w:rPr>
+                <w:b/>
+                <w:bCs/>
+              </w:rPr>
+              <w:t xml:space="preserve">Состояния/кадры</w:t>
+            </w:r>
+          </w:p>
+        </w:tc>
+        <w:tc>
+          <w:tcPr>
+            <w:tcW w:type="dxa" w:w="1500"/>
+            <w:shd w:fill="D9D9D9" w:val="clear"/>
+            <w:tcMar>
+              <w:top w:type="dxa" w:w="80"/>
+              <w:left w:type="dxa" w:w="100"/>
+              <w:bottom w:type="dxa" w:w="80"/>
+              <w:right w:type="dxa" w:w="100"/>
+            </w:tcMar>
+          </w:tcPr>
+          <w:p>
+            <w:r>
+              <w:rPr>
+                <w:b/>
+                <w:bCs/>
+              </w:rPr>
+              <w:t xml:space="preserve">Размер</w:t>
+            </w:r>
+          </w:p>
+        </w:tc>
+        <w:tc>
+          <w:tcPr>
+            <w:tcW w:type="dxa" w:w="2400"/>
+            <w:shd w:fill="D9D9D9" w:val="clear"/>
+            <w:tcMar>
+              <w:top w:type="dxa" w:w="80"/>
+              <w:left w:type="dxa" w:w="100"/>
+              <w:bottom w:type="dxa" w:w="80"/>
+              <w:right w:type="dxa" w:w="100"/>
+            </w:tcMar>
+          </w:tcPr>
+          <w:p>
+            <w:r>
+              <w:rPr>
+                <w:b/>
+                <w:bCs/>
+              </w:rPr>
+              <w:t xml:space="preserve">Комментарий</w:t>
+            </w:r>
+          </w:p>
+        </w:tc>
+      </w:tr>
+      <w:tr>
+        <w:tc>
+          <w:tcPr>
+            <w:tcW w:type="dxa" w:w="2500"/>
+            <w:tcMar>
+              <w:top w:type="dxa" w:w="80"/>
+              <w:left w:type="dxa" w:w="100"/>
+              <w:bottom w:type="dxa" w:w="80"/>
+              <w:right w:type="dxa" w:w="100"/>
+            </w:tcMar>
+          </w:tcPr>
+          <w:p>
+            <w:r>
+              <w:rPr>
+                <w:b w:val="false"/>
+                <w:bCs w:val="false"/>
+              </w:rPr>
+              <w:t xml:space="preserve">weapon_petdrone_world</w:t>
+            </w:r>
+          </w:p>
+        </w:tc>
+        <w:tc>
+          <w:tcPr>
+            <w:tcW w:type="dxa" w:w="3600"/>
+            <w:tcMar>
+              <w:top w:type="dxa" w:w="80"/>
+              <w:left w:type="dxa" w:w="100"/>
+              <w:bottom w:type="dxa" w:w="80"/>
+              <w:right w:type="dxa" w:w="100"/>
+            </w:tcMar>
+          </w:tcPr>
+          <w:p>
+            <w:r>
+              <w:rPr>
+                <w:b w:val="false"/>
+                <w:bCs w:val="false"/>
+              </w:rPr>
+              <w:t xml:space="preserve">Patrol — 4 кадра (лёгкое покачивание/парение), Attack — 3 кадра (вспышка AoE-импульса)</w:t>
+            </w:r>
+          </w:p>
+        </w:tc>
+        <w:tc>
+          <w:tcPr>
+            <w:tcW w:type="dxa" w:w="1500"/>
+            <w:tcMar>
+              <w:top w:type="dxa" w:w="80"/>
+              <w:left w:type="dxa" w:w="100"/>
+              <w:bottom w:type="dxa" w:w="80"/>
+              <w:right w:type="dxa" w:w="100"/>
+            </w:tcMar>
+          </w:tcPr>
+          <w:p>
+            <w:r>
+              <w:rPr>
+                <w:b w:val="false"/>
+                <w:bCs w:val="false"/>
+              </w:rPr>
+              <w:t xml:space="preserve">64×64 px</w:t>
+            </w:r>
+          </w:p>
+        </w:tc>
+        <w:tc>
+          <w:tcPr>
+            <w:tcW w:type="dxa" w:w="2400"/>
+            <w:tcMar>
+              <w:top w:type="dxa" w:w="80"/>
+              <w:left w:type="dxa" w:w="100"/>
+              <w:bottom w:type="dxa" w:w="80"/>
+              <w:right w:type="dxa" w:w="100"/>
+            </w:tcMar>
+          </w:tcPr>
+          <w:p>
+            <w:r>
+              <w:rPr>
+                <w:b w:val="false"/>
+                <w:bCs w:val="false"/>
+              </w:rPr>
+              <w:t xml:space="preserve">Сам дрон-питомец в мире — отдельный объект, не часть char_monter</w:t>
+            </w:r>
+          </w:p>
+        </w:tc>
+      </w:tr>
+      <w:tr>
+        <w:tc>
+          <w:tcPr>
+            <w:tcW w:type="dxa" w:w="2500"/>
+            <w:tcMar>
+              <w:top w:type="dxa" w:w="80"/>
+              <w:left w:type="dxa" w:w="100"/>
+              <w:bottom w:type="dxa" w:w="80"/>
+              <w:right w:type="dxa" w:w="100"/>
+            </w:tcMar>
+          </w:tcPr>
+          <w:p>
+            <w:r>
+              <w:rPr>
+                <w:b w:val="false"/>
+                <w:bCs w:val="false"/>
+              </w:rPr>
+              <w:t xml:space="preserve">weapon_petdrone_icon</w:t>
+            </w:r>
+          </w:p>
+        </w:tc>
+        <w:tc>
+          <w:tcPr>
+            <w:tcW w:type="dxa" w:w="3600"/>
+            <w:tcMar>
+              <w:top w:type="dxa" w:w="80"/>
+              <w:left w:type="dxa" w:w="100"/>
+              <w:bottom w:type="dxa" w:w="80"/>
+              <w:right w:type="dxa" w:w="100"/>
+            </w:tcMar>
+          </w:tcPr>
+          <w:p>
+            <w:r>
+              <w:rPr>
+                <w:b w:val="false"/>
+                <w:bCs w:val="false"/>
+              </w:rPr>
+              <w:t xml:space="preserve">1 статичная иконка</w:t>
+            </w:r>
+          </w:p>
+        </w:tc>
+        <w:tc>
+          <w:tcPr>
+            <w:tcW w:type="dxa" w:w="1500"/>
+            <w:tcMar>
+              <w:top w:type="dxa" w:w="80"/>
+              <w:left w:type="dxa" w:w="100"/>
+              <w:bottom w:type="dxa" w:w="80"/>
+              <w:right w:type="dxa" w:w="100"/>
+            </w:tcMar>
+          </w:tcPr>
+          <w:p>
+            <w:r>
+              <w:rPr>
+                <w:b w:val="false"/>
+                <w:bCs w:val="false"/>
+              </w:rPr>
+              <w:t xml:space="preserve">96×96 px</w:t>
+            </w:r>
+          </w:p>
+        </w:tc>
+        <w:tc>
+          <w:tcPr>
+            <w:tcW w:type="dxa" w:w="2400"/>
+            <w:tcMar>
+              <w:top w:type="dxa" w:w="80"/>
+              <w:left w:type="dxa" w:w="100"/>
+              <w:bottom w:type="dxa" w:w="80"/>
+              <w:right w:type="dxa" w:w="100"/>
+            </w:tcMar>
+          </w:tcPr>
+          <w:p>
+            <w:r>
+              <w:rPr>
+                <w:b w:val="false"/>
+                <w:bCs w:val="false"/>
+              </w:rPr>
+              <w:t xml:space="preserve">Для UI магазина, на нейтральном фоне-плашке (см. 3.3)</w:t>
+            </w:r>
+          </w:p>
+        </w:tc>
+      </w:tr>
+    </w:tbl>
+    <w:p>
+      <w:pPr>
+        <w:spacing w:after="100"/>
+      </w:pPr>
+    </w:p>
+    <w:p>
+      <w:pPr>
+        <w:pStyle w:val="Heading2"/>
+        <w:spacing w:after="120" w:before="250"/>
+      </w:pPr>
+      <w:r>
         <w:t xml:space="preserve">3.2 Портреты для экрана выбора персонажа</w:t>
+      </w:r>
+    </w:p>
+    <w:p>
+      <w:pPr>
+        <w:spacing w:after="120"/>
+      </w:pPr>
+      <w:r>
+        <w:t xml:space="preserve">Единственное место, где оружие можно нарисовать как часть образа персонажа (см. исключение в 0.7) — это статичная постановочная иллюстрация, не игровой спрайт-шит.</w:t>
       </w:r>
     </w:p>
     <w:tbl>
@@ -6167,6 +6611,14 @@
       </w:pPr>
       <w:r>
         <w:t xml:space="preserve">☐  char_lucy, char_monter</w:t>
+      </w:r>
+    </w:p>
+    <w:p>
+      <w:pPr>
+        <w:spacing w:after="100"/>
+      </w:pPr>
+      <w:r>
+        <w:t xml:space="preserve">☐  weapon_petdrone (world-спрайт + иконка)</w:t>
       </w:r>
     </w:p>
     <w:p>

</xml_diff>